<commit_message>
ui changes: modulation for gcs path and local
</commit_message>
<xml_diff>
--- a/docs/PROJECT_ARCHITECTURE_full_context.docx
+++ b/docs/PROJECT_ARCHITECTURE_full_context.docx
@@ -1139,18 +1139,21 @@
               <w:jc w:val="left"/>
             </w:pPr>
             <w:r>
-              <w:t xml:space="preserve">ui/phase1/</w:t>
-            </w:r>
-          </w:p>
-        </w:tc>
-        <w:tc>
-          <w:p>
-            <w:pPr>
-              <w:pStyle w:val="Compact"/>
-              <w:jc w:val="left"/>
-            </w:pPr>
-            <w:r>
-              <w:t xml:space="preserve">The Streamlit review UI: field_trace.py, field_view.py, evidence.py, sme_decisions.py, views/.</w:t>
+              <w:t xml:space="preserve">ui/ Th</w:t>
+            </w:r>
+          </w:p>
+        </w:tc>
+        <w:tc>
+          <w:p>
+            <w:pPr>
+              <w:pStyle w:val="Compact"/>
+              <w:jc w:val="left"/>
+            </w:pPr>
+            <w:r>
+              <w:t xml:space="preserve">e SME Review Platform — a Flask + HTML/JS SPA. app.py (Flask server), index.html, app.js, agent-trace.js, pdf-viewer.js, styles.css. Reads artifacts from local_runs/artifacts/</w:t>
+            </w:r>
+            <w:r>
+              <w:t xml:space="preserve">/.</w:t>
             </w:r>
           </w:p>
         </w:tc>
@@ -7178,7 +7181,7 @@
         <w:pStyle w:val="BodyText"/>
       </w:pPr>
       <w:r>
-        <w:t xml:space="preserve">The UI's ui/phase1/field_trace.py:assemble_field_trace() filters</w:t>
+        <w:t xml:space="preserve">The UI's ui/ (browser SPA)field_trace.py:assemble_field_trace() filters</w:t>
       </w:r>
       <w:r>
         <w:t xml:space="preserve"> </w:t>
@@ -7464,7 +7467,7 @@
         <w:t xml:space="preserve"> </w:t>
       </w:r>
       <w:r>
-        <w:t xml:space="preserve">(ui/phase1/views/sme_review_view.py) renders the four bands as</w:t>
+        <w:t xml:space="preserve">(ui/ (browser SPA)views/sme_review_view.py) renders the four bands as</w:t>
       </w:r>
       <w:r>
         <w:t xml:space="preserve"> </w:t>
@@ -7488,30 +7491,791 @@
         <w:t xml:space="preserve"> </w:t>
       </w:r>
       <w:r>
-        <w:t xml:space="preserve">rationale, and Approve / Edit / Keep actions that write</w:t>
-      </w:r>
-      <w:r>
-        <w:t xml:space="preserve"> </w:t>
-      </w:r>
-      <w:r>
-        <w:t xml:space="preserve">extraction_reviewed.json + append sme_decisions.json (original</w:t>
-      </w:r>
-      <w:r>
-        <w:t xml:space="preserve"> </w:t>
-      </w:r>
-      <w:r>
-        <w:t xml:space="preserve">immutable).</w:t>
+        <w:t xml:space="preserve">rationale, and Approve / Edit / Keep actions are captured as SME decisions in the browser and can be persisted by the operator’s workflow (the SPA reads artifacts from</w:t>
+      </w:r>
+      <w:r>
+        <w:t xml:space="preserve"> </w:t>
+      </w:r>
+      <w:r>
+        <w:rPr>
+          <w:rStyle w:val="VerbatimChar"/>
+        </w:rPr>
+        <w:t xml:space="preserve">local_runs/artifacts/&lt;doc&gt;/</w:t>
+      </w:r>
+      <w:r>
+        <w:t xml:space="preserve"> </w:t>
+      </w:r>
+      <w:r>
+        <w:t xml:space="preserve">served by</w:t>
+      </w:r>
+      <w:r>
+        <w:t xml:space="preserve"> </w:t>
+      </w:r>
+      <w:r>
+        <w:rPr>
+          <w:rStyle w:val="VerbatimChar"/>
+        </w:rPr>
+        <w:t xml:space="preserve">ui/app.py</w:t>
+      </w:r>
+      <w:r>
+        <w:t xml:space="preserve">; write-back is not currently wired end-to-end).</w:t>
+      </w:r>
+    </w:p>
+    <w:p>
+      <w:pPr>
+        <w:pStyle w:val="Heading2"/>
+      </w:pPr>
+      <w:bookmarkStart w:id="60" w:name="X7d9f3c18aee16fdce35d9cf769739bba7a2675a"/>
+      <w:r>
+        <w:t xml:space="preserve">12.1 Artifact source — local or GCS (runtime-configurable)</w:t>
+      </w:r>
+      <w:bookmarkEnd w:id="60"/>
+    </w:p>
+    <w:p>
+      <w:pPr>
+        <w:pStyle w:val="FirstParagraph"/>
+      </w:pPr>
+      <w:r>
+        <w:rPr>
+          <w:rStyle w:val="VerbatimChar"/>
+        </w:rPr>
+        <w:t xml:space="preserve">ui/app.py</w:t>
+      </w:r>
+      <w:r>
+        <w:t xml:space="preserve"> </w:t>
+      </w:r>
+      <w:r>
+        <w:t xml:space="preserve">supports two data sources through the same URL contract</w:t>
+      </w:r>
+      <w:r>
+        <w:t xml:space="preserve"> </w:t>
+      </w:r>
+      <w:r>
+        <w:t xml:space="preserve">(</w:t>
+      </w:r>
+      <w:r>
+        <w:rPr>
+          <w:rStyle w:val="VerbatimChar"/>
+        </w:rPr>
+        <w:t xml:space="preserve">/api/docs</w:t>
+      </w:r>
+      <w:r>
+        <w:t xml:space="preserve"> </w:t>
+      </w:r>
+      <w:r>
+        <w:t xml:space="preserve">and</w:t>
+      </w:r>
+      <w:r>
+        <w:t xml:space="preserve"> </w:t>
+      </w:r>
+      <w:r>
+        <w:rPr>
+          <w:rStyle w:val="VerbatimChar"/>
+        </w:rPr>
+        <w:t xml:space="preserve">/artifacts/&lt;doc&gt;/&lt;file&gt;</w:t>
+      </w:r>
+      <w:r>
+        <w:t xml:space="preserve">). The browser is</w:t>
+      </w:r>
+      <w:r>
+        <w:t xml:space="preserve"> </w:t>
+      </w:r>
+      <w:r>
+        <w:rPr>
+          <w:b/>
+        </w:rPr>
+        <w:t xml:space="preserve">source-agnostic</w:t>
+      </w:r>
+      <w:r>
+        <w:t xml:space="preserve"> </w:t>
+      </w:r>
+      <w:r>
+        <w:t xml:space="preserve">— nothing in</w:t>
+      </w:r>
+      <w:r>
+        <w:t xml:space="preserve"> </w:t>
+      </w:r>
+      <w:r>
+        <w:rPr>
+          <w:rStyle w:val="VerbatimChar"/>
+        </w:rPr>
+        <w:t xml:space="preserve">app.js</w:t>
+      </w:r>
+      <w:r>
+        <w:t xml:space="preserve"> </w:t>
+      </w:r>
+      <w:r>
+        <w:t xml:space="preserve">/</w:t>
+      </w:r>
+      <w:r>
+        <w:t xml:space="preserve"> </w:t>
+      </w:r>
+      <w:r>
+        <w:rPr>
+          <w:rStyle w:val="VerbatimChar"/>
+        </w:rPr>
+        <w:t xml:space="preserve">index.html</w:t>
+      </w:r>
+      <w:r>
+        <w:t xml:space="preserve"> </w:t>
+      </w:r>
+      <w:r>
+        <w:t xml:space="preserve">changes when the</w:t>
+      </w:r>
+      <w:r>
+        <w:t xml:space="preserve"> </w:t>
+      </w:r>
+      <w:r>
+        <w:t xml:space="preserve">source is switched. Selection is one env-var toggle read at server startup:</w:t>
+      </w:r>
+    </w:p>
+    <w:tbl>
+      <w:tblPr>
+        <w:tblStyle w:val="Table"/>
+        <w:tblW w:type="pct" w:w="4999.999999999999"/>
+        <w:tblLook w:firstRow="1"/>
+      </w:tblPr>
+      <w:tblGrid>
+        <w:gridCol w:w="2404"/>
+        <w:gridCol w:w="4242"/>
+        <w:gridCol w:w="1272"/>
+      </w:tblGrid>
+      <w:tr>
+        <w:trPr>
+          <w:cnfStyle w:firstRow="1"/>
+        </w:trPr>
+        <w:tc>
+          <w:tcPr>
+            <w:tcBorders>
+              <w:bottom w:val="single"/>
+            </w:tcBorders>
+            <w:vAlign w:val="bottom"/>
+          </w:tcPr>
+          <w:p>
+            <w:pPr>
+              <w:pStyle w:val="Compact"/>
+              <w:jc w:val="left"/>
+            </w:pPr>
+            <w:r>
+              <w:t xml:space="preserve">Env var</w:t>
+            </w:r>
+          </w:p>
+        </w:tc>
+        <w:tc>
+          <w:tcPr>
+            <w:tcBorders>
+              <w:bottom w:val="single"/>
+            </w:tcBorders>
+            <w:vAlign w:val="bottom"/>
+          </w:tcPr>
+          <w:p>
+            <w:pPr>
+              <w:pStyle w:val="Compact"/>
+              <w:jc w:val="left"/>
+            </w:pPr>
+            <w:r>
+              <w:t xml:space="preserve">Purpose</w:t>
+            </w:r>
+          </w:p>
+        </w:tc>
+        <w:tc>
+          <w:tcPr>
+            <w:tcBorders>
+              <w:bottom w:val="single"/>
+            </w:tcBorders>
+            <w:vAlign w:val="bottom"/>
+          </w:tcPr>
+          <w:p>
+            <w:pPr>
+              <w:pStyle w:val="Compact"/>
+              <w:jc w:val="left"/>
+            </w:pPr>
+            <w:r>
+              <w:t xml:space="preserve">Default</w:t>
+            </w:r>
+          </w:p>
+        </w:tc>
+      </w:tr>
+      <w:tr>
+        <w:tc>
+          <w:p>
+            <w:pPr>
+              <w:pStyle w:val="Compact"/>
+              <w:jc w:val="left"/>
+            </w:pPr>
+            <w:r>
+              <w:rPr>
+                <w:rStyle w:val="VerbatimChar"/>
+              </w:rPr>
+              <w:t xml:space="preserve">GCS_ARTIFACTS_BUCKET</w:t>
+            </w:r>
+          </w:p>
+        </w:tc>
+        <w:tc>
+          <w:p>
+            <w:pPr>
+              <w:pStyle w:val="Compact"/>
+              <w:jc w:val="left"/>
+            </w:pPr>
+            <w:r>
+              <w:t xml:space="preserve">Set = GCS mode; unset/empty = local mode</w:t>
+            </w:r>
+          </w:p>
+        </w:tc>
+        <w:tc>
+          <w:p>
+            <w:pPr>
+              <w:pStyle w:val="Compact"/>
+              <w:jc w:val="left"/>
+            </w:pPr>
+            <w:r>
+              <w:rPr>
+                <w:rStyle w:val="VerbatimChar"/>
+              </w:rPr>
+              <w:t xml:space="preserve">""</w:t>
+            </w:r>
+            <w:r>
+              <w:t xml:space="preserve"> </w:t>
+            </w:r>
+            <w:r>
+              <w:t xml:space="preserve">(= local)</w:t>
+            </w:r>
+          </w:p>
+        </w:tc>
+      </w:tr>
+      <w:tr>
+        <w:tc>
+          <w:p>
+            <w:pPr>
+              <w:pStyle w:val="Compact"/>
+              <w:jc w:val="left"/>
+            </w:pPr>
+            <w:r>
+              <w:rPr>
+                <w:rStyle w:val="VerbatimChar"/>
+              </w:rPr>
+              <w:t xml:space="preserve">GCS_ARTIFACTS_PREFIX</w:t>
+            </w:r>
+          </w:p>
+        </w:tc>
+        <w:tc>
+          <w:p>
+            <w:pPr>
+              <w:pStyle w:val="Compact"/>
+              <w:jc w:val="left"/>
+            </w:pPr>
+            <w:r>
+              <w:t xml:space="preserve">Key prefix inside the bucket for per-doc folders</w:t>
+            </w:r>
+          </w:p>
+        </w:tc>
+        <w:tc>
+          <w:p>
+            <w:pPr>
+              <w:pStyle w:val="Compact"/>
+              <w:jc w:val="left"/>
+            </w:pPr>
+            <w:r>
+              <w:rPr>
+                <w:rStyle w:val="VerbatimChar"/>
+              </w:rPr>
+              <w:t xml:space="preserve">artifacts/</w:t>
+            </w:r>
+          </w:p>
+        </w:tc>
+      </w:tr>
+      <w:tr>
+        <w:tc>
+          <w:p>
+            <w:pPr>
+              <w:pStyle w:val="Compact"/>
+              <w:jc w:val="left"/>
+            </w:pPr>
+            <w:r>
+              <w:rPr>
+                <w:rStyle w:val="VerbatimChar"/>
+              </w:rPr>
+              <w:t xml:space="preserve">GOOGLE_APPLICATION_CREDENTIALS</w:t>
+            </w:r>
+          </w:p>
+        </w:tc>
+        <w:tc>
+          <w:p>
+            <w:pPr>
+              <w:pStyle w:val="Compact"/>
+              <w:jc w:val="left"/>
+            </w:pPr>
+            <w:r>
+              <w:t xml:space="preserve">Service-account JSON path (optional on GKE / Cloud Run)</w:t>
+            </w:r>
+          </w:p>
+        </w:tc>
+        <w:tc>
+          <w:p>
+            <w:pPr>
+              <w:pStyle w:val="Compact"/>
+              <w:jc w:val="left"/>
+            </w:pPr>
+            <w:r>
+              <w:t xml:space="preserve">uses ADC</w:t>
+            </w:r>
+          </w:p>
+        </w:tc>
+      </w:tr>
+      <w:tr>
+        <w:tc>
+          <w:p>
+            <w:pPr>
+              <w:pStyle w:val="Compact"/>
+              <w:jc w:val="left"/>
+            </w:pPr>
+            <w:r>
+              <w:rPr>
+                <w:rStyle w:val="VerbatimChar"/>
+              </w:rPr>
+              <w:t xml:space="preserve">PORT</w:t>
+            </w:r>
+          </w:p>
+        </w:tc>
+        <w:tc>
+          <w:p>
+            <w:pPr>
+              <w:pStyle w:val="Compact"/>
+              <w:jc w:val="left"/>
+            </w:pPr>
+            <w:r>
+              <w:t xml:space="preserve">Server port</w:t>
+            </w:r>
+          </w:p>
+        </w:tc>
+        <w:tc>
+          <w:p>
+            <w:pPr>
+              <w:pStyle w:val="Compact"/>
+              <w:jc w:val="left"/>
+            </w:pPr>
+            <w:r>
+              <w:rPr>
+                <w:rStyle w:val="VerbatimChar"/>
+              </w:rPr>
+              <w:t xml:space="preserve">8501</w:t>
+            </w:r>
+          </w:p>
+        </w:tc>
+      </w:tr>
+    </w:tbl>
+    <w:p>
+      <w:pPr>
+        <w:pStyle w:val="BodyText"/>
+      </w:pPr>
+      <w:r>
+        <w:rPr>
+          <w:b/>
+        </w:rPr>
+        <w:t xml:space="preserve">Local mode (default).</w:t>
+      </w:r>
+      <w:r>
+        <w:t xml:space="preserve"> </w:t>
+      </w:r>
+      <w:r>
+        <w:t xml:space="preserve">When</w:t>
+      </w:r>
+      <w:r>
+        <w:t xml:space="preserve"> </w:t>
+      </w:r>
+      <w:r>
+        <w:rPr>
+          <w:rStyle w:val="VerbatimChar"/>
+        </w:rPr>
+        <w:t xml:space="preserve">GCS_ARTIFACTS_BUCKET</w:t>
+      </w:r>
+      <w:r>
+        <w:t xml:space="preserve"> </w:t>
+      </w:r>
+      <w:r>
+        <w:t xml:space="preserve">is unset,</w:t>
+      </w:r>
+      <w:r>
+        <w:t xml:space="preserve"> </w:t>
+      </w:r>
+      <w:r>
+        <w:rPr>
+          <w:rStyle w:val="VerbatimChar"/>
+        </w:rPr>
+        <w:t xml:space="preserve">list_docs()</w:t>
+      </w:r>
+      <w:r>
+        <w:t xml:space="preserve"> </w:t>
+      </w:r>
+      <w:r>
+        <w:t xml:space="preserve">walks</w:t>
+      </w:r>
+      <w:r>
+        <w:t xml:space="preserve"> </w:t>
+      </w:r>
+      <w:r>
+        <w:rPr>
+          <w:rStyle w:val="VerbatimChar"/>
+        </w:rPr>
+        <w:t xml:space="preserve">local_runs/artifacts/</w:t>
+      </w:r>
+      <w:r>
+        <w:t xml:space="preserve"> </w:t>
+      </w:r>
+      <w:r>
+        <w:t xml:space="preserve">for subfolders that contain</w:t>
+      </w:r>
+      <w:r>
+        <w:t xml:space="preserve"> </w:t>
+      </w:r>
+      <w:r>
+        <w:rPr>
+          <w:rStyle w:val="VerbatimChar"/>
+        </w:rPr>
+        <w:t xml:space="preserve">extraction_v2.json</w:t>
+      </w:r>
+      <w:r>
+        <w:t xml:space="preserve">,</w:t>
+      </w:r>
+      <w:r>
+        <w:t xml:space="preserve"> </w:t>
+      </w:r>
+      <w:r>
+        <w:t xml:space="preserve">and</w:t>
+      </w:r>
+      <w:r>
+        <w:t xml:space="preserve"> </w:t>
+      </w:r>
+      <w:r>
+        <w:rPr>
+          <w:rStyle w:val="VerbatimChar"/>
+        </w:rPr>
+        <w:t xml:space="preserve">serve_artifact()</w:t>
+      </w:r>
+      <w:r>
+        <w:t xml:space="preserve"> </w:t>
+      </w:r>
+      <w:r>
+        <w:t xml:space="preserve">streams files from</w:t>
+      </w:r>
+      <w:r>
+        <w:t xml:space="preserve"> </w:t>
+      </w:r>
+      <w:r>
+        <w:rPr>
+          <w:rStyle w:val="VerbatimChar"/>
+        </w:rPr>
+        <w:t xml:space="preserve">local_runs/artifacts/&lt;doc&gt;/&lt;file&gt;</w:t>
+      </w:r>
+      <w:r>
+        <w:t xml:space="preserve">.</w:t>
+      </w:r>
+    </w:p>
+    <w:p>
+      <w:pPr>
+        <w:pStyle w:val="BodyText"/>
+      </w:pPr>
+      <w:r>
+        <w:rPr>
+          <w:b/>
+        </w:rPr>
+        <w:t xml:space="preserve">GCS mode.</w:t>
+      </w:r>
+      <w:r>
+        <w:t xml:space="preserve"> </w:t>
+      </w:r>
+      <w:r>
+        <w:t xml:space="preserve">When</w:t>
+      </w:r>
+      <w:r>
+        <w:t xml:space="preserve"> </w:t>
+      </w:r>
+      <w:r>
+        <w:rPr>
+          <w:rStyle w:val="VerbatimChar"/>
+        </w:rPr>
+        <w:t xml:space="preserve">GCS_ARTIFACTS_BUCKET</w:t>
+      </w:r>
+      <w:r>
+        <w:t xml:space="preserve"> </w:t>
+      </w:r>
+      <w:r>
+        <w:t xml:space="preserve">is set,</w:t>
+      </w:r>
+      <w:r>
+        <w:t xml:space="preserve"> </w:t>
+      </w:r>
+      <w:r>
+        <w:rPr>
+          <w:rStyle w:val="VerbatimChar"/>
+        </w:rPr>
+        <w:t xml:space="preserve">list_docs()</w:t>
+      </w:r>
+      <w:r>
+        <w:t xml:space="preserve"> </w:t>
+      </w:r>
+      <w:r>
+        <w:t xml:space="preserve">calls</w:t>
+      </w:r>
+      <w:r>
+        <w:t xml:space="preserve"> </w:t>
+      </w:r>
+      <w:r>
+        <w:rPr>
+          <w:rStyle w:val="VerbatimChar"/>
+        </w:rPr>
+        <w:t xml:space="preserve">storage.Client().bucket(BUCKET).list_blobs(prefix=BUCKET_PREFIX)</w:t>
+      </w:r>
+      <w:r>
+        <w:t xml:space="preserve"> </w:t>
+      </w:r>
+      <w:r>
+        <w:t xml:space="preserve">and groups</w:t>
+      </w:r>
+      <w:r>
+        <w:t xml:space="preserve"> </w:t>
+      </w:r>
+      <w:r>
+        <w:t xml:space="preserve">blob names into</w:t>
+      </w:r>
+      <w:r>
+        <w:t xml:space="preserve"> </w:t>
+      </w:r>
+      <w:r>
+        <w:rPr>
+          <w:rStyle w:val="VerbatimChar"/>
+        </w:rPr>
+        <w:t xml:space="preserve">{doc_id}/{filename}</w:t>
+      </w:r>
+      <w:r>
+        <w:t xml:space="preserve"> </w:t>
+      </w:r>
+      <w:r>
+        <w:t xml:space="preserve">pairs.</w:t>
+      </w:r>
+      <w:r>
+        <w:t xml:space="preserve"> </w:t>
+      </w:r>
+      <w:r>
+        <w:rPr>
+          <w:rStyle w:val="VerbatimChar"/>
+        </w:rPr>
+        <w:t xml:space="preserve">serve_artifact()</w:t>
+      </w:r>
+      <w:r>
+        <w:t xml:space="preserve"> </w:t>
+      </w:r>
+      <w:r>
+        <w:t xml:space="preserve">routes through</w:t>
+      </w:r>
+      <w:r>
+        <w:t xml:space="preserve"> </w:t>
+      </w:r>
+      <w:r>
+        <w:rPr>
+          <w:rStyle w:val="VerbatimChar"/>
+        </w:rPr>
+        <w:t xml:space="preserve">_bucket().blob(...).download_as_bytes()</w:t>
+      </w:r>
+      <w:r>
+        <w:t xml:space="preserve"> </w:t>
+      </w:r>
+      <w:r>
+        <w:t xml:space="preserve">and streams the bytes back with the</w:t>
+      </w:r>
+      <w:r>
+        <w:t xml:space="preserve"> </w:t>
+      </w:r>
+      <w:r>
+        <w:t xml:space="preserve">same MIME map as the local branch.</w:t>
+      </w:r>
+    </w:p>
+    <w:p>
+      <w:pPr>
+        <w:pStyle w:val="BodyText"/>
+      </w:pPr>
+      <w:r>
+        <w:t xml:space="preserve">The GCS client is lazy-initialized —</w:t>
+      </w:r>
+      <w:r>
+        <w:t xml:space="preserve"> </w:t>
+      </w:r>
+      <w:r>
+        <w:rPr>
+          <w:rStyle w:val="VerbatimChar"/>
+        </w:rPr>
+        <w:t xml:space="preserve">google-cloud-storage</w:t>
+      </w:r>
+      <w:r>
+        <w:t xml:space="preserve"> </w:t>
+      </w:r>
+      <w:r>
+        <w:t xml:space="preserve">is not imported</w:t>
+      </w:r>
+      <w:r>
+        <w:t xml:space="preserve"> </w:t>
+      </w:r>
+      <w:r>
+        <w:t xml:space="preserve">until the first GCS request, so local dev works without gcloud credentials.</w:t>
+      </w:r>
+    </w:p>
+    <w:p>
+      <w:pPr>
+        <w:pStyle w:val="BodyText"/>
+      </w:pPr>
+      <w:r>
+        <w:rPr>
+          <w:b/>
+        </w:rPr>
+        <w:t xml:space="preserve">Path traversal defense</w:t>
+      </w:r>
+      <w:r>
+        <w:t xml:space="preserve"> </w:t>
+      </w:r>
+      <w:r>
+        <w:t xml:space="preserve">runs BEFORE either backend is touched:</w:t>
+      </w:r>
+      <w:r>
+        <w:t xml:space="preserve"> </w:t>
+      </w:r>
+      <w:r>
+        <w:rPr>
+          <w:rStyle w:val="VerbatimChar"/>
+        </w:rPr>
+        <w:t xml:space="preserve">doc_id</w:t>
+      </w:r>
+      <w:r>
+        <w:t xml:space="preserve"> </w:t>
+      </w:r>
+      <w:r>
+        <w:t xml:space="preserve">may not contain</w:t>
+      </w:r>
+      <w:r>
+        <w:t xml:space="preserve"> </w:t>
+      </w:r>
+      <w:r>
+        <w:rPr>
+          <w:rStyle w:val="VerbatimChar"/>
+        </w:rPr>
+        <w:t xml:space="preserve">/</w:t>
+      </w:r>
+      <w:r>
+        <w:t xml:space="preserve"> </w:t>
+      </w:r>
+      <w:r>
+        <w:t xml:space="preserve">or</w:t>
+      </w:r>
+      <w:r>
+        <w:t xml:space="preserve"> </w:t>
+      </w:r>
+      <w:r>
+        <w:rPr>
+          <w:rStyle w:val="VerbatimChar"/>
+        </w:rPr>
+        <w:t xml:space="preserve">..</w:t>
+      </w:r>
+      <w:r>
+        <w:t xml:space="preserve">, and</w:t>
+      </w:r>
+      <w:r>
+        <w:t xml:space="preserve"> </w:t>
+      </w:r>
+      <w:r>
+        <w:rPr>
+          <w:rStyle w:val="VerbatimChar"/>
+        </w:rPr>
+        <w:t xml:space="preserve">filename</w:t>
+      </w:r>
+      <w:r>
+        <w:t xml:space="preserve"> </w:t>
+      </w:r>
+      <w:r>
+        <w:t xml:space="preserve">may not contain</w:t>
+      </w:r>
+      <w:r>
+        <w:t xml:space="preserve"> </w:t>
+      </w:r>
+      <w:r>
+        <w:rPr>
+          <w:rStyle w:val="VerbatimChar"/>
+        </w:rPr>
+        <w:t xml:space="preserve">..</w:t>
+      </w:r>
+      <w:r>
+        <w:t xml:space="preserve">. Invalid</w:t>
+      </w:r>
+      <w:r>
+        <w:t xml:space="preserve"> </w:t>
+      </w:r>
+      <w:r>
+        <w:t xml:space="preserve">requests return</w:t>
+      </w:r>
+      <w:r>
+        <w:t xml:space="preserve"> </w:t>
+      </w:r>
+      <w:r>
+        <w:rPr>
+          <w:rStyle w:val="VerbatimChar"/>
+        </w:rPr>
+        <w:t xml:space="preserve">HTTP 400</w:t>
+      </w:r>
+      <w:r>
+        <w:t xml:space="preserve"> </w:t>
+      </w:r>
+      <w:r>
+        <w:t xml:space="preserve">without touching either backend.</w:t>
+      </w:r>
+    </w:p>
+    <w:p>
+      <w:pPr>
+        <w:pStyle w:val="BodyText"/>
+      </w:pPr>
+      <w:r>
+        <w:t xml:space="preserve">Getting artifacts INTO GCS is a separate concern — pick either (a) modify</w:t>
+      </w:r>
+      <w:r>
+        <w:t xml:space="preserve"> </w:t>
+      </w:r>
+      <w:r>
+        <w:rPr>
+          <w:rStyle w:val="VerbatimChar"/>
+        </w:rPr>
+        <w:t xml:space="preserve">core/persistence.py</w:t>
+      </w:r>
+      <w:r>
+        <w:t xml:space="preserve"> </w:t>
+      </w:r>
+      <w:r>
+        <w:t xml:space="preserve">so the pipeline writes to GCS directly, or (b) keep</w:t>
+      </w:r>
+      <w:r>
+        <w:t xml:space="preserve"> </w:t>
+      </w:r>
+      <w:r>
+        <w:t xml:space="preserve">writing to local disk and sync post-run with</w:t>
+      </w:r>
+      <w:r>
+        <w:t xml:space="preserve"> </w:t>
+      </w:r>
+      <w:r>
+        <w:rPr>
+          <w:rStyle w:val="VerbatimChar"/>
+        </w:rPr>
+        <w:t xml:space="preserve">gsutil -m rsync -r local_runs/artifacts/ gs://&lt;bucket&gt;/artifacts/</w:t>
+      </w:r>
+      <w:r>
+        <w:t xml:space="preserve">. The UI change is independent.</w:t>
       </w:r>
     </w:p>
     <w:p>
       <w:pPr>
         <w:pStyle w:val="Heading1"/>
       </w:pPr>
-      <w:bookmarkStart w:id="60" w:name="artifacts-written-per-run"/>
+      <w:bookmarkStart w:id="61" w:name="artifacts-written-per-run"/>
       <w:r>
         <w:t xml:space="preserve">13. Artifacts written per run</w:t>
       </w:r>
-      <w:bookmarkEnd w:id="60"/>
+      <w:bookmarkEnd w:id="61"/>
     </w:p>
     <w:p>
       <w:pPr>
@@ -7842,11 +8606,11 @@
       <w:pPr>
         <w:pStyle w:val="Heading1"/>
       </w:pPr>
-      <w:bookmarkStart w:id="61" w:name="extending-the-system"/>
+      <w:bookmarkStart w:id="62" w:name="extending-the-system"/>
       <w:r>
         <w:t xml:space="preserve">14. Extending the system</w:t>
       </w:r>
-      <w:bookmarkEnd w:id="61"/>
+      <w:bookmarkEnd w:id="62"/>
     </w:p>
     <w:p>
       <w:pPr>
@@ -7878,11 +8642,11 @@
       <w:pPr>
         <w:pStyle w:val="Heading3"/>
       </w:pPr>
-      <w:bookmarkStart w:id="62" w:name="add-a-field-to-an-existing-section"/>
+      <w:bookmarkStart w:id="63" w:name="add-a-field-to-an-existing-section"/>
       <w:r>
         <w:t xml:space="preserve">Add a field to an existing section</w:t>
       </w:r>
-      <w:bookmarkEnd w:id="62"/>
+      <w:bookmarkEnd w:id="63"/>
     </w:p>
     <w:p>
       <w:pPr>
@@ -7908,11 +8672,11 @@
       <w:pPr>
         <w:pStyle w:val="Heading3"/>
       </w:pPr>
-      <w:bookmarkStart w:id="63" w:name="add-a-new-section-team"/>
+      <w:bookmarkStart w:id="64" w:name="add-a-new-section-team"/>
       <w:r>
         <w:t xml:space="preserve">Add a new section / team</w:t>
       </w:r>
-      <w:bookmarkEnd w:id="63"/>
+      <w:bookmarkEnd w:id="64"/>
     </w:p>
     <w:p>
       <w:pPr>
@@ -7938,11 +8702,11 @@
       <w:pPr>
         <w:pStyle w:val="Heading3"/>
       </w:pPr>
-      <w:bookmarkStart w:id="64" w:name="Xa313679db90e9e2deec15ed1328c9bf32121518"/>
+      <w:bookmarkStart w:id="65" w:name="Xa313679db90e9e2deec15ed1328c9bf32121518"/>
       <w:r>
         <w:t xml:space="preserve">Onboard a brand-new schema (different doc type)</w:t>
       </w:r>
-      <w:bookmarkEnd w:id="64"/>
+      <w:bookmarkEnd w:id="65"/>
     </w:p>
     <w:p>
       <w:pPr>
@@ -7968,11 +8732,11 @@
       <w:pPr>
         <w:pStyle w:val="Heading1"/>
       </w:pPr>
-      <w:bookmarkStart w:id="65" w:name="testing-the-gate-suite"/>
+      <w:bookmarkStart w:id="66" w:name="testing-the-gate-suite"/>
       <w:r>
         <w:t xml:space="preserve">15. Testing — the gate suite</w:t>
       </w:r>
-      <w:bookmarkEnd w:id="65"/>
+      <w:bookmarkEnd w:id="66"/>
     </w:p>
     <w:p>
       <w:pPr>
@@ -8058,11 +8822,11 @@
       <w:pPr>
         <w:pStyle w:val="Heading1"/>
       </w:pPr>
-      <w:bookmarkStart w:id="66" w:name="X1775a99628b9199b839db71fee1c7869f870acd"/>
+      <w:bookmarkStart w:id="67" w:name="X1775a99628b9199b839db71fee1c7869f870acd"/>
       <w:r>
         <w:t xml:space="preserve">16. The evaluation module — post-extraction grading</w:t>
       </w:r>
-      <w:bookmarkEnd w:id="66"/>
+      <w:bookmarkEnd w:id="67"/>
     </w:p>
     <w:p>
       <w:pPr>
@@ -8174,11 +8938,11 @@
       <w:pPr>
         <w:pStyle w:val="Heading3"/>
       </w:pPr>
-      <w:bookmarkStart w:id="67" w:name="three-cli-modes"/>
+      <w:bookmarkStart w:id="68" w:name="three-cli-modes"/>
       <w:r>
         <w:t xml:space="preserve">16.1 Three CLI modes</w:t>
       </w:r>
-      <w:bookmarkEnd w:id="67"/>
+      <w:bookmarkEnd w:id="68"/>
     </w:p>
     <w:tbl>
       <w:tblPr>
@@ -8422,11 +9186,11 @@
       <w:pPr>
         <w:pStyle w:val="Heading3"/>
       </w:pPr>
-      <w:bookmarkStart w:id="68" w:name="the-four-color-verdict-taxonomy"/>
+      <w:bookmarkStart w:id="69" w:name="the-four-color-verdict-taxonomy"/>
       <w:r>
         <w:t xml:space="preserve">16.2 The four-color verdict taxonomy</w:t>
       </w:r>
-      <w:bookmarkEnd w:id="68"/>
+      <w:bookmarkEnd w:id="69"/>
     </w:p>
     <w:p>
       <w:pPr>
@@ -8718,7 +9482,7 @@
       <w:pPr>
         <w:pStyle w:val="Heading3"/>
       </w:pPr>
-      <w:bookmarkStart w:id="69" w:name="identity-resolution-the-gene-only-fix"/>
+      <w:bookmarkStart w:id="70" w:name="identity-resolution-the-gene-only-fix"/>
       <w:r>
         <w:t xml:space="preserve">16.3 Identity resolution — the</w:t>
       </w:r>
@@ -8740,7 +9504,7 @@
       <w:r>
         <w:t xml:space="preserve">fix</w:t>
       </w:r>
-      <w:bookmarkEnd w:id="69"/>
+      <w:bookmarkEnd w:id="70"/>
     </w:p>
     <w:p>
       <w:pPr>
@@ -8835,11 +9599,11 @@
       <w:pPr>
         <w:pStyle w:val="Heading3"/>
       </w:pPr>
-      <w:bookmarkStart w:id="70" w:name="output-artifacts"/>
+      <w:bookmarkStart w:id="71" w:name="output-artifacts"/>
       <w:r>
         <w:t xml:space="preserve">16.4 Output artifacts</w:t>
       </w:r>
-      <w:bookmarkEnd w:id="70"/>
+      <w:bookmarkEnd w:id="71"/>
     </w:p>
     <w:p>
       <w:pPr>
@@ -9183,7 +9947,7 @@
       <w:pPr>
         <w:pStyle w:val="Heading3"/>
       </w:pPr>
-      <w:bookmarkStart w:id="71" w:name="the-field_map.yaml-contract"/>
+      <w:bookmarkStart w:id="72" w:name="the-field_map.yaml-contract"/>
       <w:r>
         <w:t xml:space="preserve">16.5 The</w:t>
       </w:r>
@@ -9202,7 +9966,7 @@
       <w:r>
         <w:t xml:space="preserve">contract</w:t>
       </w:r>
-      <w:bookmarkEnd w:id="71"/>
+      <w:bookmarkEnd w:id="72"/>
     </w:p>
     <w:p>
       <w:pPr>
@@ -9324,7 +10088,7 @@
       <w:pPr>
         <w:pStyle w:val="Heading3"/>
       </w:pPr>
-      <w:bookmarkStart w:id="72" w:name="Xf9335ad1d8f0111ee105cb5d18c47339b07ac74"/>
+      <w:bookmarkStart w:id="73" w:name="Xf9335ad1d8f0111ee105cb5d18c47339b07ac74"/>
       <w:r>
         <w:t xml:space="preserve">16.6 The</w:t>
       </w:r>
@@ -9346,7 +10110,7 @@
       <w:r>
         <w:t xml:space="preserve">prompt principle</w:t>
       </w:r>
-      <w:bookmarkEnd w:id="72"/>
+      <w:bookmarkEnd w:id="73"/>
     </w:p>
     <w:p>
       <w:pPr>
@@ -9613,11 +10377,11 @@
       <w:pPr>
         <w:pStyle w:val="Heading3"/>
       </w:pPr>
-      <w:bookmarkStart w:id="73" w:name="full-reference"/>
+      <w:bookmarkStart w:id="74" w:name="full-reference"/>
       <w:r>
         <w:t xml:space="preserve">16.7 Full reference</w:t>
       </w:r>
-      <w:bookmarkEnd w:id="73"/>
+      <w:bookmarkEnd w:id="74"/>
     </w:p>
     <w:p>
       <w:pPr>
@@ -9730,11 +10494,11 @@
       <w:pPr>
         <w:pStyle w:val="Heading1"/>
       </w:pPr>
-      <w:bookmarkStart w:id="74" w:name="glossary"/>
+      <w:bookmarkStart w:id="75" w:name="glossary"/>
       <w:r>
         <w:t xml:space="preserve">17. Glossary</w:t>
       </w:r>
-      <w:bookmarkEnd w:id="74"/>
+      <w:bookmarkEnd w:id="75"/>
     </w:p>
     <w:tbl>
       <w:tblPr>
@@ -11825,6 +12589,669 @@
     <w:basedOn w:val="VerbatimChar"/>
     <w:rPr/>
   </w:style>
+  <w:style w:type="character" w:customStyle="1" w:styleId="KeywordTok">
+    <w:name w:val="KeywordTok"/>
+    <w:basedOn w:val="VerbatimChar"/>
+    <w:rPr>
+      <w:color w:val="007020"/>
+      <w:b/>
+    </w:rPr>
+  </w:style>
+  <w:style w:type="character" w:customStyle="1" w:styleId="DataTypeTok">
+    <w:name w:val="DataTypeTok"/>
+    <w:basedOn w:val="VerbatimChar"/>
+    <w:rPr>
+      <w:color w:val="902000"/>
+    </w:rPr>
+  </w:style>
+  <w:style w:type="character" w:customStyle="1" w:styleId="DecValTok">
+    <w:name w:val="DecValTok"/>
+    <w:basedOn w:val="VerbatimChar"/>
+    <w:rPr>
+      <w:color w:val="40a070"/>
+    </w:rPr>
+  </w:style>
+  <w:style w:type="character" w:customStyle="1" w:styleId="BaseNTok">
+    <w:name w:val="BaseNTok"/>
+    <w:basedOn w:val="VerbatimChar"/>
+    <w:rPr>
+      <w:color w:val="40a070"/>
+    </w:rPr>
+  </w:style>
+  <w:style w:type="character" w:customStyle="1" w:styleId="FloatTok">
+    <w:name w:val="FloatTok"/>
+    <w:basedOn w:val="VerbatimChar"/>
+    <w:rPr>
+      <w:color w:val="40a070"/>
+    </w:rPr>
+  </w:style>
+  <w:style w:type="character" w:customStyle="1" w:styleId="ConstantTok">
+    <w:name w:val="ConstantTok"/>
+    <w:basedOn w:val="VerbatimChar"/>
+    <w:rPr>
+      <w:color w:val="880000"/>
+    </w:rPr>
+  </w:style>
+  <w:style w:type="character" w:customStyle="1" w:styleId="CharTok">
+    <w:name w:val="CharTok"/>
+    <w:basedOn w:val="VerbatimChar"/>
+    <w:rPr>
+      <w:color w:val="4070a0"/>
+    </w:rPr>
+  </w:style>
+  <w:style w:type="character" w:customStyle="1" w:styleId="SpecialCharTok">
+    <w:name w:val="SpecialCharTok"/>
+    <w:basedOn w:val="VerbatimChar"/>
+    <w:rPr>
+      <w:color w:val="4070a0"/>
+    </w:rPr>
+  </w:style>
+  <w:style w:type="character" w:customStyle="1" w:styleId="StringTok">
+    <w:name w:val="StringTok"/>
+    <w:basedOn w:val="VerbatimChar"/>
+    <w:rPr>
+      <w:color w:val="4070a0"/>
+    </w:rPr>
+  </w:style>
+  <w:style w:type="character" w:customStyle="1" w:styleId="VerbatimStringTok">
+    <w:name w:val="VerbatimStringTok"/>
+    <w:basedOn w:val="VerbatimChar"/>
+    <w:rPr>
+      <w:color w:val="4070a0"/>
+    </w:rPr>
+  </w:style>
+  <w:style w:type="character" w:customStyle="1" w:styleId="SpecialStringTok">
+    <w:name w:val="SpecialStringTok"/>
+    <w:basedOn w:val="VerbatimChar"/>
+    <w:rPr>
+      <w:color w:val="bb6688"/>
+    </w:rPr>
+  </w:style>
+  <w:style w:type="character" w:customStyle="1" w:styleId="ImportTok">
+    <w:name w:val="ImportTok"/>
+    <w:basedOn w:val="VerbatimChar"/>
+    <w:rPr/>
+  </w:style>
+  <w:style w:type="character" w:customStyle="1" w:styleId="CommentTok">
+    <w:name w:val="CommentTok"/>
+    <w:basedOn w:val="VerbatimChar"/>
+    <w:rPr>
+      <w:color w:val="60a0b0"/>
+      <w:i/>
+    </w:rPr>
+  </w:style>
+  <w:style w:type="character" w:customStyle="1" w:styleId="DocumentationTok">
+    <w:name w:val="DocumentationTok"/>
+    <w:basedOn w:val="VerbatimChar"/>
+    <w:rPr>
+      <w:color w:val="ba2121"/>
+      <w:i/>
+    </w:rPr>
+  </w:style>
+  <w:style w:type="character" w:customStyle="1" w:styleId="AnnotationTok">
+    <w:name w:val="AnnotationTok"/>
+    <w:basedOn w:val="VerbatimChar"/>
+    <w:rPr>
+      <w:color w:val="60a0b0"/>
+      <w:b/>
+      <w:i/>
+    </w:rPr>
+  </w:style>
+  <w:style w:type="character" w:customStyle="1" w:styleId="CommentVarTok">
+    <w:name w:val="CommentVarTok"/>
+    <w:basedOn w:val="VerbatimChar"/>
+    <w:rPr>
+      <w:color w:val="60a0b0"/>
+      <w:b/>
+      <w:i/>
+    </w:rPr>
+  </w:style>
+  <w:style w:type="character" w:customStyle="1" w:styleId="OtherTok">
+    <w:name w:val="OtherTok"/>
+    <w:basedOn w:val="VerbatimChar"/>
+    <w:rPr>
+      <w:color w:val="007020"/>
+    </w:rPr>
+  </w:style>
+  <w:style w:type="character" w:customStyle="1" w:styleId="FunctionTok">
+    <w:name w:val="FunctionTok"/>
+    <w:basedOn w:val="VerbatimChar"/>
+    <w:rPr>
+      <w:color w:val="06287e"/>
+    </w:rPr>
+  </w:style>
+  <w:style w:type="character" w:customStyle="1" w:styleId="VariableTok">
+    <w:name w:val="VariableTok"/>
+    <w:basedOn w:val="VerbatimChar"/>
+    <w:rPr>
+      <w:color w:val="19177c"/>
+    </w:rPr>
+  </w:style>
+  <w:style w:type="character" w:customStyle="1" w:styleId="ControlFlowTok">
+    <w:name w:val="ControlFlowTok"/>
+    <w:basedOn w:val="VerbatimChar"/>
+    <w:rPr>
+      <w:color w:val="007020"/>
+      <w:b/>
+    </w:rPr>
+  </w:style>
+  <w:style w:type="character" w:customStyle="1" w:styleId="OperatorTok">
+    <w:name w:val="OperatorTok"/>
+    <w:basedOn w:val="VerbatimChar"/>
+    <w:rPr>
+      <w:color w:val="666666"/>
+    </w:rPr>
+  </w:style>
+  <w:style w:type="character" w:customStyle="1" w:styleId="BuiltInTok">
+    <w:name w:val="BuiltInTok"/>
+    <w:basedOn w:val="VerbatimChar"/>
+    <w:rPr/>
+  </w:style>
+  <w:style w:type="character" w:customStyle="1" w:styleId="ExtensionTok">
+    <w:name w:val="ExtensionTok"/>
+    <w:basedOn w:val="VerbatimChar"/>
+    <w:rPr/>
+  </w:style>
+  <w:style w:type="character" w:customStyle="1" w:styleId="PreprocessorTok">
+    <w:name w:val="PreprocessorTok"/>
+    <w:basedOn w:val="VerbatimChar"/>
+    <w:rPr>
+      <w:color w:val="bc7a00"/>
+    </w:rPr>
+  </w:style>
+  <w:style w:type="character" w:customStyle="1" w:styleId="AttributeTok">
+    <w:name w:val="AttributeTok"/>
+    <w:basedOn w:val="VerbatimChar"/>
+    <w:rPr>
+      <w:color w:val="7d9029"/>
+    </w:rPr>
+  </w:style>
+  <w:style w:type="character" w:customStyle="1" w:styleId="RegionMarkerTok">
+    <w:name w:val="RegionMarkerTok"/>
+    <w:basedOn w:val="VerbatimChar"/>
+    <w:rPr/>
+  </w:style>
+  <w:style w:type="character" w:customStyle="1" w:styleId="InformationTok">
+    <w:name w:val="InformationTok"/>
+    <w:basedOn w:val="VerbatimChar"/>
+    <w:rPr>
+      <w:color w:val="60a0b0"/>
+      <w:b/>
+      <w:i/>
+    </w:rPr>
+  </w:style>
+  <w:style w:type="character" w:customStyle="1" w:styleId="WarningTok">
+    <w:name w:val="WarningTok"/>
+    <w:basedOn w:val="VerbatimChar"/>
+    <w:rPr>
+      <w:color w:val="60a0b0"/>
+      <w:b/>
+      <w:i/>
+    </w:rPr>
+  </w:style>
+  <w:style w:type="character" w:customStyle="1" w:styleId="AlertTok">
+    <w:name w:val="AlertTok"/>
+    <w:basedOn w:val="VerbatimChar"/>
+    <w:rPr>
+      <w:color w:val="ff0000"/>
+      <w:b/>
+    </w:rPr>
+  </w:style>
+  <w:style w:type="character" w:customStyle="1" w:styleId="ErrorTok">
+    <w:name w:val="ErrorTok"/>
+    <w:basedOn w:val="VerbatimChar"/>
+    <w:rPr>
+      <w:color w:val="ff0000"/>
+      <w:b/>
+    </w:rPr>
+  </w:style>
+  <w:style w:type="character" w:customStyle="1" w:styleId="NormalTok">
+    <w:name w:val="NormalTok"/>
+    <w:basedOn w:val="VerbatimChar"/>
+    <w:rPr/>
+  </w:style>
+  <w:style w:type="character" w:customStyle="1" w:styleId="KeywordTok">
+    <w:name w:val="KeywordTok"/>
+    <w:basedOn w:val="VerbatimChar"/>
+    <w:rPr>
+      <w:color w:val="007020"/>
+      <w:b/>
+    </w:rPr>
+  </w:style>
+  <w:style w:type="character" w:customStyle="1" w:styleId="DataTypeTok">
+    <w:name w:val="DataTypeTok"/>
+    <w:basedOn w:val="VerbatimChar"/>
+    <w:rPr>
+      <w:color w:val="902000"/>
+    </w:rPr>
+  </w:style>
+  <w:style w:type="character" w:customStyle="1" w:styleId="DecValTok">
+    <w:name w:val="DecValTok"/>
+    <w:basedOn w:val="VerbatimChar"/>
+    <w:rPr>
+      <w:color w:val="40a070"/>
+    </w:rPr>
+  </w:style>
+  <w:style w:type="character" w:customStyle="1" w:styleId="BaseNTok">
+    <w:name w:val="BaseNTok"/>
+    <w:basedOn w:val="VerbatimChar"/>
+    <w:rPr>
+      <w:color w:val="40a070"/>
+    </w:rPr>
+  </w:style>
+  <w:style w:type="character" w:customStyle="1" w:styleId="FloatTok">
+    <w:name w:val="FloatTok"/>
+    <w:basedOn w:val="VerbatimChar"/>
+    <w:rPr>
+      <w:color w:val="40a070"/>
+    </w:rPr>
+  </w:style>
+  <w:style w:type="character" w:customStyle="1" w:styleId="ConstantTok">
+    <w:name w:val="ConstantTok"/>
+    <w:basedOn w:val="VerbatimChar"/>
+    <w:rPr>
+      <w:color w:val="880000"/>
+    </w:rPr>
+  </w:style>
+  <w:style w:type="character" w:customStyle="1" w:styleId="CharTok">
+    <w:name w:val="CharTok"/>
+    <w:basedOn w:val="VerbatimChar"/>
+    <w:rPr>
+      <w:color w:val="4070a0"/>
+    </w:rPr>
+  </w:style>
+  <w:style w:type="character" w:customStyle="1" w:styleId="SpecialCharTok">
+    <w:name w:val="SpecialCharTok"/>
+    <w:basedOn w:val="VerbatimChar"/>
+    <w:rPr>
+      <w:color w:val="4070a0"/>
+    </w:rPr>
+  </w:style>
+  <w:style w:type="character" w:customStyle="1" w:styleId="StringTok">
+    <w:name w:val="StringTok"/>
+    <w:basedOn w:val="VerbatimChar"/>
+    <w:rPr>
+      <w:color w:val="4070a0"/>
+    </w:rPr>
+  </w:style>
+  <w:style w:type="character" w:customStyle="1" w:styleId="VerbatimStringTok">
+    <w:name w:val="VerbatimStringTok"/>
+    <w:basedOn w:val="VerbatimChar"/>
+    <w:rPr>
+      <w:color w:val="4070a0"/>
+    </w:rPr>
+  </w:style>
+  <w:style w:type="character" w:customStyle="1" w:styleId="SpecialStringTok">
+    <w:name w:val="SpecialStringTok"/>
+    <w:basedOn w:val="VerbatimChar"/>
+    <w:rPr>
+      <w:color w:val="bb6688"/>
+    </w:rPr>
+  </w:style>
+  <w:style w:type="character" w:customStyle="1" w:styleId="ImportTok">
+    <w:name w:val="ImportTok"/>
+    <w:basedOn w:val="VerbatimChar"/>
+    <w:rPr/>
+  </w:style>
+  <w:style w:type="character" w:customStyle="1" w:styleId="CommentTok">
+    <w:name w:val="CommentTok"/>
+    <w:basedOn w:val="VerbatimChar"/>
+    <w:rPr>
+      <w:color w:val="60a0b0"/>
+      <w:i/>
+    </w:rPr>
+  </w:style>
+  <w:style w:type="character" w:customStyle="1" w:styleId="DocumentationTok">
+    <w:name w:val="DocumentationTok"/>
+    <w:basedOn w:val="VerbatimChar"/>
+    <w:rPr>
+      <w:color w:val="ba2121"/>
+      <w:i/>
+    </w:rPr>
+  </w:style>
+  <w:style w:type="character" w:customStyle="1" w:styleId="AnnotationTok">
+    <w:name w:val="AnnotationTok"/>
+    <w:basedOn w:val="VerbatimChar"/>
+    <w:rPr>
+      <w:color w:val="60a0b0"/>
+      <w:b/>
+      <w:i/>
+    </w:rPr>
+  </w:style>
+  <w:style w:type="character" w:customStyle="1" w:styleId="CommentVarTok">
+    <w:name w:val="CommentVarTok"/>
+    <w:basedOn w:val="VerbatimChar"/>
+    <w:rPr>
+      <w:color w:val="60a0b0"/>
+      <w:b/>
+      <w:i/>
+    </w:rPr>
+  </w:style>
+  <w:style w:type="character" w:customStyle="1" w:styleId="OtherTok">
+    <w:name w:val="OtherTok"/>
+    <w:basedOn w:val="VerbatimChar"/>
+    <w:rPr>
+      <w:color w:val="007020"/>
+    </w:rPr>
+  </w:style>
+  <w:style w:type="character" w:customStyle="1" w:styleId="FunctionTok">
+    <w:name w:val="FunctionTok"/>
+    <w:basedOn w:val="VerbatimChar"/>
+    <w:rPr>
+      <w:color w:val="06287e"/>
+    </w:rPr>
+  </w:style>
+  <w:style w:type="character" w:customStyle="1" w:styleId="VariableTok">
+    <w:name w:val="VariableTok"/>
+    <w:basedOn w:val="VerbatimChar"/>
+    <w:rPr>
+      <w:color w:val="19177c"/>
+    </w:rPr>
+  </w:style>
+  <w:style w:type="character" w:customStyle="1" w:styleId="ControlFlowTok">
+    <w:name w:val="ControlFlowTok"/>
+    <w:basedOn w:val="VerbatimChar"/>
+    <w:rPr>
+      <w:color w:val="007020"/>
+      <w:b/>
+    </w:rPr>
+  </w:style>
+  <w:style w:type="character" w:customStyle="1" w:styleId="OperatorTok">
+    <w:name w:val="OperatorTok"/>
+    <w:basedOn w:val="VerbatimChar"/>
+    <w:rPr>
+      <w:color w:val="666666"/>
+    </w:rPr>
+  </w:style>
+  <w:style w:type="character" w:customStyle="1" w:styleId="BuiltInTok">
+    <w:name w:val="BuiltInTok"/>
+    <w:basedOn w:val="VerbatimChar"/>
+    <w:rPr/>
+  </w:style>
+  <w:style w:type="character" w:customStyle="1" w:styleId="ExtensionTok">
+    <w:name w:val="ExtensionTok"/>
+    <w:basedOn w:val="VerbatimChar"/>
+    <w:rPr/>
+  </w:style>
+  <w:style w:type="character" w:customStyle="1" w:styleId="PreprocessorTok">
+    <w:name w:val="PreprocessorTok"/>
+    <w:basedOn w:val="VerbatimChar"/>
+    <w:rPr>
+      <w:color w:val="bc7a00"/>
+    </w:rPr>
+  </w:style>
+  <w:style w:type="character" w:customStyle="1" w:styleId="AttributeTok">
+    <w:name w:val="AttributeTok"/>
+    <w:basedOn w:val="VerbatimChar"/>
+    <w:rPr>
+      <w:color w:val="7d9029"/>
+    </w:rPr>
+  </w:style>
+  <w:style w:type="character" w:customStyle="1" w:styleId="RegionMarkerTok">
+    <w:name w:val="RegionMarkerTok"/>
+    <w:basedOn w:val="VerbatimChar"/>
+    <w:rPr/>
+  </w:style>
+  <w:style w:type="character" w:customStyle="1" w:styleId="InformationTok">
+    <w:name w:val="InformationTok"/>
+    <w:basedOn w:val="VerbatimChar"/>
+    <w:rPr>
+      <w:color w:val="60a0b0"/>
+      <w:b/>
+      <w:i/>
+    </w:rPr>
+  </w:style>
+  <w:style w:type="character" w:customStyle="1" w:styleId="WarningTok">
+    <w:name w:val="WarningTok"/>
+    <w:basedOn w:val="VerbatimChar"/>
+    <w:rPr>
+      <w:color w:val="60a0b0"/>
+      <w:b/>
+      <w:i/>
+    </w:rPr>
+  </w:style>
+  <w:style w:type="character" w:customStyle="1" w:styleId="AlertTok">
+    <w:name w:val="AlertTok"/>
+    <w:basedOn w:val="VerbatimChar"/>
+    <w:rPr>
+      <w:color w:val="ff0000"/>
+      <w:b/>
+    </w:rPr>
+  </w:style>
+  <w:style w:type="character" w:customStyle="1" w:styleId="ErrorTok">
+    <w:name w:val="ErrorTok"/>
+    <w:basedOn w:val="VerbatimChar"/>
+    <w:rPr>
+      <w:color w:val="ff0000"/>
+      <w:b/>
+    </w:rPr>
+  </w:style>
+  <w:style w:type="character" w:customStyle="1" w:styleId="NormalTok">
+    <w:name w:val="NormalTok"/>
+    <w:basedOn w:val="VerbatimChar"/>
+    <w:rPr/>
+  </w:style>
+  <w:style w:type="character" w:customStyle="1" w:styleId="KeywordTok">
+    <w:name w:val="KeywordTok"/>
+    <w:basedOn w:val="VerbatimChar"/>
+    <w:rPr>
+      <w:color w:val="007020"/>
+      <w:b/>
+    </w:rPr>
+  </w:style>
+  <w:style w:type="character" w:customStyle="1" w:styleId="DataTypeTok">
+    <w:name w:val="DataTypeTok"/>
+    <w:basedOn w:val="VerbatimChar"/>
+    <w:rPr>
+      <w:color w:val="902000"/>
+    </w:rPr>
+  </w:style>
+  <w:style w:type="character" w:customStyle="1" w:styleId="DecValTok">
+    <w:name w:val="DecValTok"/>
+    <w:basedOn w:val="VerbatimChar"/>
+    <w:rPr>
+      <w:color w:val="40a070"/>
+    </w:rPr>
+  </w:style>
+  <w:style w:type="character" w:customStyle="1" w:styleId="BaseNTok">
+    <w:name w:val="BaseNTok"/>
+    <w:basedOn w:val="VerbatimChar"/>
+    <w:rPr>
+      <w:color w:val="40a070"/>
+    </w:rPr>
+  </w:style>
+  <w:style w:type="character" w:customStyle="1" w:styleId="FloatTok">
+    <w:name w:val="FloatTok"/>
+    <w:basedOn w:val="VerbatimChar"/>
+    <w:rPr>
+      <w:color w:val="40a070"/>
+    </w:rPr>
+  </w:style>
+  <w:style w:type="character" w:customStyle="1" w:styleId="ConstantTok">
+    <w:name w:val="ConstantTok"/>
+    <w:basedOn w:val="VerbatimChar"/>
+    <w:rPr>
+      <w:color w:val="880000"/>
+    </w:rPr>
+  </w:style>
+  <w:style w:type="character" w:customStyle="1" w:styleId="CharTok">
+    <w:name w:val="CharTok"/>
+    <w:basedOn w:val="VerbatimChar"/>
+    <w:rPr>
+      <w:color w:val="4070a0"/>
+    </w:rPr>
+  </w:style>
+  <w:style w:type="character" w:customStyle="1" w:styleId="SpecialCharTok">
+    <w:name w:val="SpecialCharTok"/>
+    <w:basedOn w:val="VerbatimChar"/>
+    <w:rPr>
+      <w:color w:val="4070a0"/>
+    </w:rPr>
+  </w:style>
+  <w:style w:type="character" w:customStyle="1" w:styleId="StringTok">
+    <w:name w:val="StringTok"/>
+    <w:basedOn w:val="VerbatimChar"/>
+    <w:rPr>
+      <w:color w:val="4070a0"/>
+    </w:rPr>
+  </w:style>
+  <w:style w:type="character" w:customStyle="1" w:styleId="VerbatimStringTok">
+    <w:name w:val="VerbatimStringTok"/>
+    <w:basedOn w:val="VerbatimChar"/>
+    <w:rPr>
+      <w:color w:val="4070a0"/>
+    </w:rPr>
+  </w:style>
+  <w:style w:type="character" w:customStyle="1" w:styleId="SpecialStringTok">
+    <w:name w:val="SpecialStringTok"/>
+    <w:basedOn w:val="VerbatimChar"/>
+    <w:rPr>
+      <w:color w:val="bb6688"/>
+    </w:rPr>
+  </w:style>
+  <w:style w:type="character" w:customStyle="1" w:styleId="ImportTok">
+    <w:name w:val="ImportTok"/>
+    <w:basedOn w:val="VerbatimChar"/>
+    <w:rPr/>
+  </w:style>
+  <w:style w:type="character" w:customStyle="1" w:styleId="CommentTok">
+    <w:name w:val="CommentTok"/>
+    <w:basedOn w:val="VerbatimChar"/>
+    <w:rPr>
+      <w:color w:val="60a0b0"/>
+      <w:i/>
+    </w:rPr>
+  </w:style>
+  <w:style w:type="character" w:customStyle="1" w:styleId="DocumentationTok">
+    <w:name w:val="DocumentationTok"/>
+    <w:basedOn w:val="VerbatimChar"/>
+    <w:rPr>
+      <w:color w:val="ba2121"/>
+      <w:i/>
+    </w:rPr>
+  </w:style>
+  <w:style w:type="character" w:customStyle="1" w:styleId="AnnotationTok">
+    <w:name w:val="AnnotationTok"/>
+    <w:basedOn w:val="VerbatimChar"/>
+    <w:rPr>
+      <w:color w:val="60a0b0"/>
+      <w:b/>
+      <w:i/>
+    </w:rPr>
+  </w:style>
+  <w:style w:type="character" w:customStyle="1" w:styleId="CommentVarTok">
+    <w:name w:val="CommentVarTok"/>
+    <w:basedOn w:val="VerbatimChar"/>
+    <w:rPr>
+      <w:color w:val="60a0b0"/>
+      <w:b/>
+      <w:i/>
+    </w:rPr>
+  </w:style>
+  <w:style w:type="character" w:customStyle="1" w:styleId="OtherTok">
+    <w:name w:val="OtherTok"/>
+    <w:basedOn w:val="VerbatimChar"/>
+    <w:rPr>
+      <w:color w:val="007020"/>
+    </w:rPr>
+  </w:style>
+  <w:style w:type="character" w:customStyle="1" w:styleId="FunctionTok">
+    <w:name w:val="FunctionTok"/>
+    <w:basedOn w:val="VerbatimChar"/>
+    <w:rPr>
+      <w:color w:val="06287e"/>
+    </w:rPr>
+  </w:style>
+  <w:style w:type="character" w:customStyle="1" w:styleId="VariableTok">
+    <w:name w:val="VariableTok"/>
+    <w:basedOn w:val="VerbatimChar"/>
+    <w:rPr>
+      <w:color w:val="19177c"/>
+    </w:rPr>
+  </w:style>
+  <w:style w:type="character" w:customStyle="1" w:styleId="ControlFlowTok">
+    <w:name w:val="ControlFlowTok"/>
+    <w:basedOn w:val="VerbatimChar"/>
+    <w:rPr>
+      <w:color w:val="007020"/>
+      <w:b/>
+    </w:rPr>
+  </w:style>
+  <w:style w:type="character" w:customStyle="1" w:styleId="OperatorTok">
+    <w:name w:val="OperatorTok"/>
+    <w:basedOn w:val="VerbatimChar"/>
+    <w:rPr>
+      <w:color w:val="666666"/>
+    </w:rPr>
+  </w:style>
+  <w:style w:type="character" w:customStyle="1" w:styleId="BuiltInTok">
+    <w:name w:val="BuiltInTok"/>
+    <w:basedOn w:val="VerbatimChar"/>
+    <w:rPr/>
+  </w:style>
+  <w:style w:type="character" w:customStyle="1" w:styleId="ExtensionTok">
+    <w:name w:val="ExtensionTok"/>
+    <w:basedOn w:val="VerbatimChar"/>
+    <w:rPr/>
+  </w:style>
+  <w:style w:type="character" w:customStyle="1" w:styleId="PreprocessorTok">
+    <w:name w:val="PreprocessorTok"/>
+    <w:basedOn w:val="VerbatimChar"/>
+    <w:rPr>
+      <w:color w:val="bc7a00"/>
+    </w:rPr>
+  </w:style>
+  <w:style w:type="character" w:customStyle="1" w:styleId="AttributeTok">
+    <w:name w:val="AttributeTok"/>
+    <w:basedOn w:val="VerbatimChar"/>
+    <w:rPr>
+      <w:color w:val="7d9029"/>
+    </w:rPr>
+  </w:style>
+  <w:style w:type="character" w:customStyle="1" w:styleId="RegionMarkerTok">
+    <w:name w:val="RegionMarkerTok"/>
+    <w:basedOn w:val="VerbatimChar"/>
+    <w:rPr/>
+  </w:style>
+  <w:style w:type="character" w:customStyle="1" w:styleId="InformationTok">
+    <w:name w:val="InformationTok"/>
+    <w:basedOn w:val="VerbatimChar"/>
+    <w:rPr>
+      <w:color w:val="60a0b0"/>
+      <w:b/>
+      <w:i/>
+    </w:rPr>
+  </w:style>
+  <w:style w:type="character" w:customStyle="1" w:styleId="WarningTok">
+    <w:name w:val="WarningTok"/>
+    <w:basedOn w:val="VerbatimChar"/>
+    <w:rPr>
+      <w:color w:val="60a0b0"/>
+      <w:b/>
+      <w:i/>
+    </w:rPr>
+  </w:style>
+  <w:style w:type="character" w:customStyle="1" w:styleId="AlertTok">
+    <w:name w:val="AlertTok"/>
+    <w:basedOn w:val="VerbatimChar"/>
+    <w:rPr>
+      <w:color w:val="ff0000"/>
+      <w:b/>
+    </w:rPr>
+  </w:style>
+  <w:style w:type="character" w:customStyle="1" w:styleId="ErrorTok">
+    <w:name w:val="ErrorTok"/>
+    <w:basedOn w:val="VerbatimChar"/>
+    <w:rPr>
+      <w:color w:val="ff0000"/>
+      <w:b/>
+    </w:rPr>
+  </w:style>
+  <w:style w:type="character" w:customStyle="1" w:styleId="NormalTok">
+    <w:name w:val="NormalTok"/>
+    <w:basedOn w:val="VerbatimChar"/>
+    <w:rPr/>
+  </w:style>
 </w:styles>
 </file>
 

</xml_diff>